<commit_message>
Adicionando arquivos na pasta data
</commit_message>
<xml_diff>
--- a/data/legal/nda_contrato_sigilo.docx
+++ b/data/legal/nda_contrato_sigilo.docx
@@ -48,7 +48,12 @@
       </w:r>
       <w:proofErr w:type="spellEnd"/>
       <w:r>
-        <w:t xml:space="preserve"> utilizados internamente. O vazamento de informações de arquitetura da nuvem (OCI) resultará em rescisão imediata do contrato.</w:t>
+        <w:t xml:space="preserve"> utilizados internamente. </w:t>
+      </w:r>
+    </w:p>
+    <w:p>
+      <w:r>
+        <w:t>O vazamento de informações de arquitetura da nuvem (OCI) resultará em rescisão imediata do contrato.</w:t>
       </w:r>
     </w:p>
     <w:sectPr>
@@ -664,6 +669,7 @@
   <w:style w:type="character" w:default="1" w:styleId="Fontepargpadro">
     <w:name w:val="Default Paragraph Font"/>
     <w:uiPriority w:val="1"/>
+    <w:semiHidden/>
     <w:unhideWhenUsed/>
   </w:style>
   <w:style w:type="table" w:default="1" w:styleId="Tabelanormal">

</xml_diff>